<commit_message>
zynara: TDD V4 docx — add cost-management (production, out of scope) to §7.1 and roadmap
Co-Authored-By: Claude Sonnet 5 <noreply@anthropic.com>
</commit_message>
<xml_diff>
--- a/zynara/docs/design/Care-Approval-IQ-TDD-V4.docx
+++ b/zynara/docs/design/Care-Approval-IQ-TDD-V4.docx
@@ -3408,6 +3408,28 @@
           <w:i w:val="0"/>
           <w:sz w:val="22"/>
         </w:rPr>
+        <w:t>Cost management (FinOps)</w:t>
+      </w:r>
+      <w:r>
+        <w:rPr>
+          <w:b w:val="0"/>
+          <w:i w:val="0"/>
+          <w:sz w:val="22"/>
+        </w:rPr>
+        <w:t xml:space="preserve"> — a per-case and per-tenant running-cost view: tokens and tool calls per agent priced at the negotiated Foundry rate, plus fixed cloud cost, against the manual cost it replaces; with Azure budgets and alerts. Not in scope for this build, but a must for production. Measured today: about 28K tokens and 30-60 s per case on the hosted models.</w:t>
+      </w:r>
+    </w:p>
+    <w:p>
+      <w:pPr>
+        <w:pStyle w:val="ListBullet"/>
+        <w:spacing w:after="60"/>
+      </w:pPr>
+      <w:r>
+        <w:rPr>
+          <w:b/>
+          <w:i w:val="0"/>
+          <w:sz w:val="22"/>
+        </w:rPr>
         <w:t>HA / DR</w:t>
       </w:r>
       <w:r>
@@ -3531,6 +3553,20 @@
           <w:sz w:val="22"/>
         </w:rPr>
         <w:t>Peer-to-peer prep — the clinician's talking points for the call with the insurer's medical director</w:t>
+      </w:r>
+    </w:p>
+    <w:p>
+      <w:pPr>
+        <w:pStyle w:val="ListBullet"/>
+        <w:spacing w:after="60"/>
+      </w:pPr>
+      <w:r>
+        <w:rPr>
+          <w:b w:val="0"/>
+          <w:i w:val="0"/>
+          <w:sz w:val="22"/>
+        </w:rPr>
+        <w:t>Cost management dashboard — per-case and per-tenant running cost against the manual cost it replaces, with budgets and alerts (not in scope now; required for production)</w:t>
       </w:r>
     </w:p>
     <w:p>

</xml_diff>